<commit_message>
Courant Continental: episode 1 (and finale) set on a Friday evening
Co-Authored-By: Claude Opus 5.5 <noreply@anthropic.com>
Claude-Session: https://claude.ai/code/session_01UwE7vS8kwz9bgnxqVkaFwC
</commit_message>
<xml_diff>
--- a/docs/courant-continental-cameroun/album-saison-1-illustrateur.docx
+++ b/docs/courant-continental-cameroun/album-saison-1-illustrateur.docx
@@ -2904,7 +2904,7 @@
           <w:iCs/>
           <w:i/>
         </w:rPr>
-        <w:t xml:space="preserve">Un samedi soir, une bière tiède met tout un bar en procès… et lance la plus grande enquête de l’histoire de Nkoagne.</w:t>
+        <w:t xml:space="preserve">Un vendredi soir, une bière tiède met tout un bar en procès… et lance la plus grande enquête de l’histoire de Nkoagne.</w:t>
       </w:r>
       <w:r>
         <w:t xml:space="preserve"> </w:t>
@@ -2933,7 +2933,7 @@
         <w:t xml:space="preserve">Le Dernier Kilowatt</w:t>
       </w:r>
       <w:r>
-        <w:t xml:space="preserve">, quartier Nkoagne. Samedi soir, après une longue semaine de travail.</w:t>
+        <w:t xml:space="preserve">, quartier Nkoagne. Vendredi soir, après une longue semaine de travail : c’est la paie, c’est le week-end qui commence.</w:t>
       </w:r>
     </w:p>
     <w:bookmarkStart w:id="31" w:name="Xa586495eddf11853010a535a1ae3d8427bedac1"/>
@@ -3057,7 +3057,7 @@
                 <w:iCs/>
                 <w:i/>
               </w:rPr>
-              <w:t xml:space="preserve">Nkoagne, samedi soir. Ici, on oublie la semaine… quand le courant le permet.</w:t>
+              <w:t xml:space="preserve">Nkoagne, vendredi soir. La semaine est finie, la paie est tombée. Ici, on oublie tout… quand le courant le permet.</w:t>
             </w:r>
           </w:p>
         </w:tc>
@@ -50836,7 +50836,7 @@
               <w:jc w:val="left"/>
             </w:pPr>
             <w:r>
-              <w:t xml:space="preserve">Oncle Fagot tire Pater Glaçon par la manche. Pater Glaçon montre une affiche : « SAMEDI : GRANDE FINALE — MONSIEUR 2030 PRÉSENTE SON BULLETIN ». Monsieur 2030 lâche son cartable, qui s’écrase sur son pied.</w:t>
+              <w:t xml:space="preserve">Oncle Fagot tire Pater Glaçon par la manche. Pater Glaçon montre une affiche : « VENDREDI SOIR : GRANDE FINALE — MONSIEUR 2030 PRÉSENTE SON BULLETIN ». Monsieur 2030 lâche son cartable, qui s’écrase sur son pied.</w:t>
             </w:r>
           </w:p>
         </w:tc>
@@ -51762,7 +51762,7 @@
         <w:t xml:space="preserve">Le Dernier Kilowatt</w:t>
       </w:r>
       <w:r>
-        <w:t xml:space="preserve">, transformé en plateau de télécrochet. Samedi soir. Nous ne sommes</w:t>
+        <w:t xml:space="preserve">, transformé en plateau de télécrochet. Vendredi soir, comme au premier épisode. Nous ne sommes</w:t>
       </w:r>
       <w:r>
         <w:t xml:space="preserve"> </w:t>
@@ -51886,7 +51886,7 @@
                 <w:iCs/>
                 <w:i/>
               </w:rPr>
-              <w:t xml:space="preserve">Nkoagne, samedi soir. On n’est pas en 2030. Personne ne sait encore ce qui sera atteint. C’est justement pour ça qu’on note les preuves.</w:t>
+              <w:t xml:space="preserve">Nkoagne, vendredi soir. On n’est pas en 2030. Personne ne sait encore ce qui sera atteint. C’est justement pour ça qu’on note les preuves.</w:t>
             </w:r>
             <w:r>
               <w:t xml:space="preserve"> </w:t>

</xml_diff>

<commit_message>
Courant Continental: series subtitle 'Les mégawatts sont annoncés… mais la bière est chaude !'
Co-Authored-By: Claude Opus 5.5 <noreply@anthropic.com>
Claude-Session: https://claude.ai/code/session_01UwE7vS8kwz9bgnxqVkaFwC
</commit_message>
<xml_diff>
--- a/docs/courant-continental-cameroun/album-saison-1-illustrateur.docx
+++ b/docs/courant-continental-cameroun/album-saison-1-illustrateur.docx
@@ -45,13 +45,13 @@
         <w:t xml:space="preserve">COURANT CONTINENTAL — CAMEROUN</w:t>
       </w:r>
     </w:p>
-    <w:bookmarkStart w:id="21" w:name="X6bc454f8d694943597943e9312a821b9b13838c"/>
+    <w:bookmarkStart w:id="21" w:name="Xaa5684dd7fe9fab60884d2b5bb1e97d6b1158d2"/>
     <w:p>
       <w:pPr>
         <w:pStyle w:val="Heading2"/>
       </w:pPr>
       <w:r>
-        <w:t xml:space="preserve">« Les mégawatts sont arrivés… mais la bière est chaude ! »</w:t>
+        <w:t xml:space="preserve">« Les mégawatts sont annoncés… mais la bière est chaude ! »</w:t>
       </w:r>
     </w:p>
     <w:bookmarkStart w:id="20" w:name="X6d45d6b2d88c1016d9fc54731fbedfb944fc89a"/>

</xml_diff>

<commit_message>
Courant Continental: album cover page with the new title; fix UTF-8 metadata encoding
Co-Authored-By: Claude Opus 5.5 <noreply@anthropic.com>
Claude-Session: https://claude.ai/code/session_01UwE7vS8kwz9bgnxqVkaFwC
</commit_message>
<xml_diff>
--- a/docs/courant-continental-cameroun/album-saison-1-illustrateur.docx
+++ b/docs/courant-continental-cameroun/album-saison-1-illustrateur.docx
@@ -7,7 +7,197 @@
         <w:pStyle w:val="Title"/>
       </w:pPr>
       <w:r>
-        <w:t xml:space="preserve">Courant Continental ��� Cameroun �� Saison 1 (illustrateur)</w:t>
+        <w:t xml:space="preserve">COURANT</w:t>
+      </w:r>
+      <w:r>
+        <w:t xml:space="preserve"> </w:t>
+      </w:r>
+      <w:r>
+        <w:t xml:space="preserve">CONTINENTAL</w:t>
+      </w:r>
+      <w:r>
+        <w:t xml:space="preserve"> </w:t>
+      </w:r>
+      <w:r>
+        <w:t xml:space="preserve">—</w:t>
+      </w:r>
+      <w:r>
+        <w:t xml:space="preserve"> </w:t>
+      </w:r>
+      <w:r>
+        <w:t xml:space="preserve">CAMEROUN</w:t>
+      </w:r>
+    </w:p>
+    <w:p>
+      <w:pPr>
+        <w:pStyle w:val="Subtitle"/>
+      </w:pPr>
+      <w:r>
+        <w:t xml:space="preserve">«</w:t>
+      </w:r>
+      <w:r>
+        <w:t xml:space="preserve"> </w:t>
+      </w:r>
+      <w:r>
+        <w:t xml:space="preserve">Les</w:t>
+      </w:r>
+      <w:r>
+        <w:t xml:space="preserve"> </w:t>
+      </w:r>
+      <w:r>
+        <w:t xml:space="preserve">mégawatts</w:t>
+      </w:r>
+      <w:r>
+        <w:t xml:space="preserve"> </w:t>
+      </w:r>
+      <w:r>
+        <w:t xml:space="preserve">sont</w:t>
+      </w:r>
+      <w:r>
+        <w:t xml:space="preserve"> </w:t>
+      </w:r>
+      <w:r>
+        <w:t xml:space="preserve">annoncés…</w:t>
+      </w:r>
+      <w:r>
+        <w:t xml:space="preserve"> </w:t>
+      </w:r>
+      <w:r>
+        <w:t xml:space="preserve">mais</w:t>
+      </w:r>
+      <w:r>
+        <w:t xml:space="preserve"> </w:t>
+      </w:r>
+      <w:r>
+        <w:t xml:space="preserve">la</w:t>
+      </w:r>
+      <w:r>
+        <w:t xml:space="preserve"> </w:t>
+      </w:r>
+      <w:r>
+        <w:t xml:space="preserve">bière</w:t>
+      </w:r>
+      <w:r>
+        <w:t xml:space="preserve"> </w:t>
+      </w:r>
+      <w:r>
+        <w:t xml:space="preserve">est</w:t>
+      </w:r>
+      <w:r>
+        <w:t xml:space="preserve"> </w:t>
+      </w:r>
+      <w:r>
+        <w:t xml:space="preserve">chaude</w:t>
+      </w:r>
+      <w:r>
+        <w:t xml:space="preserve"> </w:t>
+      </w:r>
+      <w:r>
+        <w:t xml:space="preserve">!</w:t>
+      </w:r>
+      <w:r>
+        <w:t xml:space="preserve"> </w:t>
+      </w:r>
+      <w:r>
+        <w:t xml:space="preserve">»</w:t>
+      </w:r>
+    </w:p>
+    <w:p>
+      <w:pPr>
+        <w:pStyle w:val="Date"/>
+      </w:pPr>
+      <w:r>
+        <w:t xml:space="preserve">Saison</w:t>
+      </w:r>
+      <w:r>
+        <w:t xml:space="preserve"> </w:t>
+      </w:r>
+      <w:r>
+        <w:t xml:space="preserve">1</w:t>
+      </w:r>
+      <w:r>
+        <w:t xml:space="preserve"> </w:t>
+      </w:r>
+      <w:r>
+        <w:t xml:space="preserve">—</w:t>
+      </w:r>
+      <w:r>
+        <w:t xml:space="preserve"> </w:t>
+      </w:r>
+      <w:r>
+        <w:t xml:space="preserve">scénario</w:t>
+      </w:r>
+      <w:r>
+        <w:t xml:space="preserve"> </w:t>
+      </w:r>
+      <w:r>
+        <w:t xml:space="preserve">complet</w:t>
+      </w:r>
+      <w:r>
+        <w:t xml:space="preserve"> </w:t>
+      </w:r>
+      <w:r>
+        <w:t xml:space="preserve">pour</w:t>
+      </w:r>
+      <w:r>
+        <w:t xml:space="preserve"> </w:t>
+      </w:r>
+      <w:r>
+        <w:t xml:space="preserve">l’illustrateur</w:t>
+      </w:r>
+      <w:r>
+        <w:t xml:space="preserve"> </w:t>
+      </w:r>
+      <w:r>
+        <w:t xml:space="preserve">·</w:t>
+      </w:r>
+      <w:r>
+        <w:t xml:space="preserve"> </w:t>
+      </w:r>
+      <w:r>
+        <w:t xml:space="preserve">20</w:t>
+      </w:r>
+      <w:r>
+        <w:t xml:space="preserve"> </w:t>
+      </w:r>
+      <w:r>
+        <w:t xml:space="preserve">épisodes</w:t>
+      </w:r>
+      <w:r>
+        <w:t xml:space="preserve"> </w:t>
+      </w:r>
+      <w:r>
+        <w:t xml:space="preserve">·</w:t>
+      </w:r>
+      <w:r>
+        <w:t xml:space="preserve"> </w:t>
+      </w:r>
+      <w:r>
+        <w:t xml:space="preserve">80</w:t>
+      </w:r>
+      <w:r>
+        <w:t xml:space="preserve"> </w:t>
+      </w:r>
+      <w:r>
+        <w:t xml:space="preserve">planches</w:t>
+      </w:r>
+      <w:r>
+        <w:t xml:space="preserve"> </w:t>
+      </w:r>
+      <w:r>
+        <w:t xml:space="preserve">·</w:t>
+      </w:r>
+      <w:r>
+        <w:t xml:space="preserve"> </w:t>
+      </w:r>
+      <w:r>
+        <w:t xml:space="preserve">400</w:t>
+      </w:r>
+      <w:r>
+        <w:t xml:space="preserve"> </w:t>
+      </w:r>
+      <w:r>
+        <w:t xml:space="preserve">cases</w:t>
       </w:r>
     </w:p>
     <w:sdt>
@@ -63631,7 +63821,7 @@
         <w:rFonts w:asciiTheme="minorHAnsi" w:cstheme="minorBidi" w:eastAsiaTheme="minorHAnsi" w:hAnsiTheme="minorHAnsi"/>
         <w:sz w:val="24"/>
         <w:szCs w:val="24"/>
-        <w:lang w:bidi="ar-SA" w:eastAsia="en-US" w:val="en-US"/>
+        <w:lang w:bidi="ar-SA" w:eastAsia="en-US" w:val="fr"/>
       </w:rPr>
     </w:rPrDefault>
     <w:pPrDefault>

</xml_diff>